<commit_message>
test runs and file cleanup
</commit_message>
<xml_diff>
--- a/Code/Matlab/Functions/Functions_Readme.docx
+++ b/Code/Matlab/Functions/Functions_Readme.docx
@@ -2065,6 +2065,51 @@
       <w:proofErr w:type="spellEnd"/>
       <w:r>
         <w:t xml:space="preserve"> – Not really a function but a plot to show BPA radius and diameter over contraction as a function of diameter. Third plot shows that resting length, using the equations from Chou and Hannaford and Martens and Boblan, don’t affect the curve.</w:t>
+      </w:r>
+    </w:p>
+    <w:p>
+      <w:r>
+        <w:rPr>
+          <w:b/>
+          <w:bCs/>
+        </w:rPr>
+        <w:t xml:space="preserve">spring_series – Small standalone example script: plots force–deflection for a soft spring (k1 = 100) alone versus in series with a much stiffer spring (k2 = 1000), illustrating how a stiff series element barely changes overall compliance (the bracket-compliance idea behind the Xi work). Not referenced by other code.</w:t>
+      </w:r>
+    </w:p>
+    <w:p>
+      <w:r>
+        <w:rPr>
+          <w:b/>
+          <w:bCs/>
+        </w:rPr>
+        <w:t xml:space="preserve">Inputs:</w:t>
+      </w:r>
+    </w:p>
+    <w:p>
+      <w:r>
+        <w:rPr>
+          <w:b/>
+          <w:bCs/>
+        </w:rPr>
+        <w:t xml:space="preserve">none (constants set in the script)</w:t>
+      </w:r>
+    </w:p>
+    <w:p>
+      <w:r>
+        <w:rPr>
+          <w:b/>
+          <w:bCs/>
+        </w:rPr>
+        <w:t xml:space="preserve">Output:</w:t>
+      </w:r>
+    </w:p>
+    <w:p>
+      <w:r>
+        <w:rPr>
+          <w:b/>
+          <w:bCs/>
+        </w:rPr>
+        <w:t xml:space="preserve">Two figures: Force vs. distance and distance vs. force, for the two spring cases.</w:t>
       </w:r>
     </w:p>
     <w:p/>

</xml_diff>